<commit_message>
feat: change cities to Banglore for Wissen/Morgan Stanley and Chennai for TCS
</commit_message>
<xml_diff>
--- a/210809CS5486362.docx
+++ b/210809CS5486362.docx
@@ -436,7 +436,7 @@
           <w:color w:val="333333"/>
           <w:sz w:val="20"/>
         </w:rPr>
-        <w:t xml:space="preserve"> | Mumbai, India</w:t>
+        <w:t xml:space="preserve"> | Banglore, India</w:t>
       </w:r>
       <w:r>
         <w:tab/>
@@ -640,7 +640,7 @@
           <w:color w:val="333333"/>
           <w:sz w:val="20"/>
         </w:rPr>
-        <w:t xml:space="preserve"> | Pune, India</w:t>
+        <w:t xml:space="preserve"> | Chennai, India</w:t>
       </w:r>
       <w:r>
         <w:tab/>

</xml_diff>

<commit_message>
feat: cat oneko animation
</commit_message>
<xml_diff>
--- a/210809CS5486362.docx
+++ b/210809CS5486362.docx
@@ -165,7 +165,7 @@
           <w:color w:val="333333"/>
           <w:sz w:val="19"/>
         </w:rPr>
-        <w:t>High-performance Senior / Staff Software Engineer (L6 equivalent) with 7+ years of hands-on experience architecting, scaling, and securing distributed ledger, transactional, and next-generation AI platforms. Recognized expert in optimizing p99 latency in ultra-high throughput environments, resolving complex distributed state challenges, and integrating autonomous multi-agent workflows as high-scale system capabilities. Proven track record of spearheading zero-downtime microservice migrations, designing resilient transactional workflows ($10B+ daily volume), and cutting operational latency by up to 99%. Expert in Java/Spring ecosystem, Kafka event-driven backbones, caching topologies, and robust system-level consistency models.</w:t>
+        <w:t>Senior Software Engineer with 7+ years of hands-on experience developing and scaling distributed ledger, transactional, and AI platforms. Experienced in optimizing p99 latency in high throughput environments, resolving distributed state challenges, and integrating multi-agent workflows. Proven track record of supporting zero-downtime microservice migrations, contributing to resilient high volume transactional workflows, and cutting operational latency. Strong background in Java/Spring ecosystem, Kafka event-driven backbones, caching topologies, and robust system-level consistency models.</w:t>
       </w:r>
     </w:p>
     <w:p>
@@ -495,7 +495,7 @@
           <w:color w:val="333333"/>
           <w:sz w:val="19"/>
         </w:rPr>
-        <w:t>Architected and deployed an enterprise-grade meta-orchestration platform utilizing autonomous multi-agent networks (via LangGraph and custom semantic state trees) to automate institutional-grade market onboarding (legal entities, depositories, agent accounts). Built event-driven compilation engines that dynamically generate schema migrations (Liquibase) and pull requests, compressing the onboarding pipeline from 3 weeks to ~10 minutes (a 99.9% operational efficiency gain) with zero schema drift.</w:t>
+        <w:t>Owned the development of a meta-orchestration platform utilizing autonomous multi-agent workflows to automate market onboarding (legal entities, depositories, agent accounts). Built event-driven compilation engines that dynamically generate schema migrations (Liquibase) and pull requests, compressing the onboarding pipeline from 3 weeks to ~10 minutes with zero schema drift.</w:t>
       </w:r>
     </w:p>
     <w:p>
@@ -527,7 +527,7 @@
           <w:color w:val="333333"/>
           <w:sz w:val="19"/>
         </w:rPr>
-        <w:t>Engineered a distributed data-aggregation and log-analysis engine to index heterogeneous, multi-system database and legacy mainframe ledger streams (processing billions of events). Integrated a custom RAG pipeline and dynamic Knowledge Graphs into a hierarchical, multi-agent diagnostic framework. Automated break detection and root-cause analysis, compressing cross-border trade desk investigations from weeks to &lt;5 minutes.</w:t>
+        <w:t>Implemented a distributed data-aggregation and log-analysis engine to index multi-system database and legacy mainframe ledger streams (processing high-volume events). Integrated a RAG pipeline and Knowledge Graphs into a multi-agent diagnostic framework. Automated break detection and root-cause analysis, compressing cross-border trade desk investigations from weeks to &lt;5 minutes.</w:t>
       </w:r>
     </w:p>
     <w:p>
@@ -559,7 +559,7 @@
           <w:color w:val="333333"/>
           <w:sz w:val="19"/>
         </w:rPr>
-        <w:t>Redesigned Morgan Stanley’s legacy trade-scoping rules system, migrating from a brittle, rules-based structure prone to validation failures to a market-driven policy matrix. Reduced overall rule-base complexity by 85%, eliminating edge cases that previously exposed the firm to millions in transactional settlement risk.</w:t>
+        <w:t>Led the migration of Morgan Stanley’s legacy trade-scoping rules system to a market-driven rules. Reduced overall rule-base complexity by 85%, improving the system's reliability and reducing transactional settlement risk.</w:t>
       </w:r>
     </w:p>
     <w:p>
@@ -591,7 +591,7 @@
           <w:color w:val="333333"/>
           <w:sz w:val="19"/>
         </w:rPr>
-        <w:t>Led the distributed systems design for the Asia-Pacific trade settlement infrastructure, safely processing 1.5M+ transactions daily ($10B+ transactional volume). Implemented distributed transactional consensus, Saga orchestration patterns, and idempotent ingestion filters to guarantee strict 'exactly-once' processing under extreme market volatility.</w:t>
+        <w:t>Owned the settlements core, settlements adapter and Trade Capture Interface for the Asia-Pacific trade settlement infrastructure, safely processing 1.5M+ transactions daily. Implemented saga coordinator, distributed transactional consensus, and idempotent ingestion filters.</w:t>
       </w:r>
     </w:p>
     <w:p>
@@ -699,7 +699,7 @@
           <w:color w:val="333333"/>
           <w:sz w:val="19"/>
         </w:rPr>
-        <w:t>Spearheaded the architectural redesign of a highly degraded core telecommunications provisioning microservice. Replaced synchronous, blocking HTTP polling with a high-throughput, event-driven data ingestion pipeline using Apache Kafka and a distributed Redis cache-aside topology. Slashed p99 latency by 99.6% (from 12 seconds to 40 milliseconds) while enforcing strict eventual consistency models between MongoDB and relational datastores.</w:t>
+        <w:t>Led migration of a core telecommunications provisioning microservice to an event-driven architecture. Replaced synchronous HTTP polling with a high-throughput data ingestion pipeline using Apache Kafka and a distributed Redis cache-aside topology. Slashed p99 latency from 12 seconds to 40 milliseconds while enforcing eventual consistency models between MongoDB and relational data stores.</w:t>
       </w:r>
     </w:p>
     <w:p>
@@ -731,7 +731,7 @@
           <w:color w:val="333333"/>
           <w:sz w:val="19"/>
         </w:rPr>
-        <w:t>Designed and deployed a highly scalable, partitioned event-driven messaging backbone using Kafka, configured with custom partitioners, consumer group scaling, and backpressure handling. Achieved throughput scaling of 100k+ RPS during peak telemetry traffic bursts without message loss.</w:t>
+        <w:t>Designed Kafka event schema and deployed a partitioned messaging backbone using Kafka, configured with custom partitioners, consumer group scaling, and backpressure handling. Supported throughput scaling of 100k+ RPS during peak telemetry traffic bursts without message loss.</w:t>
       </w:r>
     </w:p>
     <w:p>
@@ -763,7 +763,7 @@
           <w:color w:val="333333"/>
           <w:sz w:val="19"/>
         </w:rPr>
-        <w:t>Re-engineered legacy synchronous APIs into non-blocking, reactive asynchronous streams (using Spring WebFlux/CompletableFuture), improving concurrent connection handling by 5x under peak telecommunication workloads.</w:t>
+        <w:t>Migrated legacy synchronous APIs into non-blocking, reactive asynchronous streams (using Spring WebFlux/CompletableFuture), improving concurrent connection handling by 5x under peak telecommunication workloads.</w:t>
       </w:r>
     </w:p>
     <w:p>
@@ -915,7 +915,7 @@
           <w:color w:val="333333"/>
           <w:sz w:val="19"/>
         </w:rPr>
-        <w:t>Architected and built a highly configurable, high-performance rule-engine framework to parse and match incoming accounts receivable data. Elevated straight-through payment reconciliation automation from 20% to 80% for Fortune 500 enterprise clients, reducing manual accounts-receivable aging cycles by 70%.</w:t>
+        <w:t>Built a configurable rule-engine framework to parse and match incoming accounts receivable data. Elevated straight-through payment reconciliation automation from 20% to 80% for enterprise clients, reducing manual accounts-receivable aging cycles by 70%.</w:t>
       </w:r>
     </w:p>
     <w:p>
@@ -947,39 +947,7 @@
           <w:color w:val="333333"/>
           <w:sz w:val="19"/>
         </w:rPr>
-        <w:t>Engineered a robust, high-volume financial parsing and ingestion pipeline supporting standard global banking formats (BAI2 and MT940). Designed streaming parsers that processed 500MB+ banking statement files containing millions of transactions with strict transactional isolation and duplicate detection (idempotent ledger writes).</w:t>
-      </w:r>
-    </w:p>
-    <w:p>
-      <w:pPr>
-        <w:spacing w:before="0" w:after="50" w:line="252" w:lineRule="auto"/>
-        <w:ind w:left="360" w:hanging="216"/>
-      </w:pPr>
-      <w:r>
-        <w:rPr>
-          <w:rFonts w:ascii="Arial" w:hAnsi="Arial"/>
-          <w:b/>
-          <w:color w:val="1F4E79"/>
-          <w:sz w:val="19"/>
-        </w:rPr>
-        <w:t xml:space="preserve">•  </w:t>
-      </w:r>
-      <w:r>
-        <w:rPr>
-          <w:rFonts w:ascii="Arial" w:hAnsi="Arial"/>
-          <w:b/>
-          <w:color w:val="333333"/>
-          <w:sz w:val="19"/>
-        </w:rPr>
-        <w:t xml:space="preserve">Distributed Observability &amp; Performance Tuning: </w:t>
-      </w:r>
-      <w:r>
-        <w:rPr>
-          <w:rFonts w:ascii="Arial" w:hAnsi="Arial"/>
-          <w:color w:val="333333"/>
-          <w:sz w:val="19"/>
-        </w:rPr>
-        <w:t>Designed and established an enterprise-wide observability framework integrating distributed tracing (ELK Stack, Prometheus, Zipkin) and structured logging. Enabled proactive performance bottleneck identification, reducing mean-time-to-detection (MTTD) of anomalies from 4 hours to under 5 minutes across multi-tenant SaaS environments.</w:t>
+        <w:t>Implemented a high-volume financial parsing and ingestion pipeline supporting standard global banking formats (BAI2 and MT940). Developed streaming parsers that processed 500MB+ banking statement files with transactional isolation and duplicate detection.</w:t>
       </w:r>
     </w:p>
     <w:p>
@@ -1360,7 +1328,7 @@
           <w:color w:val="333333"/>
           <w:sz w:val="19"/>
         </w:rPr>
-        <w:t>Bachelor of Technology (B.Tech.) in Computer Science and Engineering</w:t>
+        <w:t>Bachelor of Technology in Computer Science and Engineering</w:t>
       </w:r>
       <w:r>
         <w:rPr>

</xml_diff>